<commit_message>
feat: Knowledge Library architecture plan v1.4
Agent-agnostic knowledge library with four agents (indexer, librarian,
researcher, intern), inference-first content design, projection-based
agent configs, and a complete quality feedback loop.
</commit_message>
<xml_diff>
--- a/knowledge-library-plan.docx
+++ b/knowledge-library-plan.docx
@@ -89,7 +89,7 @@
           <w:sz w:val="20"/>
           <w:szCs w:val="20"/>
         </w:rPr>
-        <w:t xml:space="preserve">1.3</w:t>
+        <w:t xml:space="preserve">1.4</w:t>
       </w:r>
     </w:p>
     <w:p>
@@ -358,6 +358,34 @@
           <w:szCs w:val="20"/>
         </w:rPr>
         <w:t xml:space="preserve">The library stores foundational knowledge — principles, workflows, constraints — that is true regardless of which agent runtime consumes it. Agent-specific configurations (Claude skills, Cursor rules, OpenAI instructions) are generated projections of this foundational knowledge, not the source of truth. The library is a platform, not an accessory to any single agent.</w:t>
+      </w:r>
+    </w:p>
+    <w:p>
+      <w:pPr>
+        <w:pStyle w:val="ListParagraph"/>
+        <w:numPr>
+          <w:ilvl w:val="0"/>
+          <w:numId w:val="2"/>
+        </w:numPr>
+        <w:spacing w:before="40" w:after="40"/>
+      </w:pPr>
+      <w:r>
+        <w:rPr>
+          <w:rFonts w:ascii="Arial" w:cs="Arial" w:eastAsia="Arial" w:hAnsi="Arial"/>
+          <w:b/>
+          <w:bCs/>
+          <w:sz w:val="20"/>
+          <w:szCs w:val="20"/>
+        </w:rPr>
+        <w:t xml:space="preserve">Inference-first content design. </w:t>
+      </w:r>
+      <w:r>
+        <w:rPr>
+          <w:rFonts w:ascii="Arial" w:cs="Arial" w:eastAsia="Arial" w:hAnsi="Arial"/>
+          <w:sz w:val="20"/>
+          <w:szCs w:val="20"/>
+        </w:rPr>
+        <w:t xml:space="preserve">Foundational entries in /meta/foundational/ are optimised for agent consumption, not human readability. This means: high information density per token, explicit declarative statements rather than narrative prose, consistent terminology across entries, unambiguous taxonomic relationships, and every constraint and exception stated rather than implied. Human-readable versions are generated on demand through the projection layer. The library’s markdown is structured knowledge that happens to be stored in markdown, not documentation.</w:t>
       </w:r>
     </w:p>
     <w:p>
@@ -1418,15 +1446,15 @@
           <w:sz w:val="20"/>
           <w:szCs w:val="20"/>
         </w:rPr>
-        <w:t xml:space="preserve">Link validation: </w:t>
-      </w:r>
-      <w:r>
-        <w:rPr>
-          <w:rFonts w:ascii="Arial" w:cs="Arial" w:eastAsia="Arial" w:hAnsi="Arial"/>
-          <w:sz w:val="20"/>
-          <w:szCs w:val="20"/>
-        </w:rPr>
-        <w:t xml:space="preserve">Check all reference URLs. Flag broken links, detect redirects, note if content has changed significantly since last check.</w:t>
+        <w:t xml:space="preserve">Inference optimisation: </w:t>
+      </w:r>
+      <w:r>
+        <w:rPr>
+          <w:rFonts w:ascii="Arial" w:cs="Arial" w:eastAsia="Arial" w:hAnsi="Arial"/>
+          <w:sz w:val="20"/>
+          <w:szCs w:val="20"/>
+        </w:rPr>
+        <w:t xml:space="preserve">When enriching entries, the goal is not “make this read better” but “make this more inferrable.” Reduce ambiguity, increase density, standardise terminology, make relationships explicit, state every constraint and exception. Prefer “CONSTRAINT: X defaults to Y. Always set Z explicitly.” over narrative prose like “One thing to watch out for is that X defaults to Y.”</w:t>
       </w:r>
     </w:p>
     <w:p>
@@ -1446,15 +1474,15 @@
           <w:sz w:val="20"/>
           <w:szCs w:val="20"/>
         </w:rPr>
-        <w:t xml:space="preserve">Deduplication: </w:t>
-      </w:r>
-      <w:r>
-        <w:rPr>
-          <w:rFonts w:ascii="Arial" w:cs="Arial" w:eastAsia="Arial" w:hAnsi="Arial"/>
-          <w:sz w:val="20"/>
-          <w:szCs w:val="20"/>
-        </w:rPr>
-        <w:t xml:space="preserve">Detect entries that cover substantially the same knowledge. Merge them into one richer entry, preserving the best content from each.</w:t>
+        <w:t xml:space="preserve">Link validation: </w:t>
+      </w:r>
+      <w:r>
+        <w:rPr>
+          <w:rFonts w:ascii="Arial" w:cs="Arial" w:eastAsia="Arial" w:hAnsi="Arial"/>
+          <w:sz w:val="20"/>
+          <w:szCs w:val="20"/>
+        </w:rPr>
+        <w:t xml:space="preserve">Check all reference URLs. Flag broken links, detect redirects, note if content has changed significantly since last check.</w:t>
       </w:r>
     </w:p>
     <w:p>
@@ -1474,15 +1502,15 @@
           <w:sz w:val="20"/>
           <w:szCs w:val="20"/>
         </w:rPr>
-        <w:t xml:space="preserve">Relationship discovery: </w:t>
-      </w:r>
-      <w:r>
-        <w:rPr>
-          <w:rFonts w:ascii="Arial" w:cs="Arial" w:eastAsia="Arial" w:hAnsi="Arial"/>
-          <w:sz w:val="20"/>
-          <w:szCs w:val="20"/>
-        </w:rPr>
-        <w:t xml:space="preserve">After enriching an entry, scan for related entries. Create typed edges: "related-to", "depends-on", "supersedes", "example-of".</w:t>
+        <w:t xml:space="preserve">Deduplication: </w:t>
+      </w:r>
+      <w:r>
+        <w:rPr>
+          <w:rFonts w:ascii="Arial" w:cs="Arial" w:eastAsia="Arial" w:hAnsi="Arial"/>
+          <w:sz w:val="20"/>
+          <w:szCs w:val="20"/>
+        </w:rPr>
+        <w:t xml:space="preserve">Detect entries that cover substantially the same knowledge. Merge them into one richer entry, preserving the best content from each.</w:t>
       </w:r>
     </w:p>
     <w:p>
@@ -1502,15 +1530,15 @@
           <w:sz w:val="20"/>
           <w:szCs w:val="20"/>
         </w:rPr>
-        <w:t xml:space="preserve">Folder hygiene: </w:t>
-      </w:r>
-      <w:r>
-        <w:rPr>
-          <w:rFonts w:ascii="Arial" w:cs="Arial" w:eastAsia="Arial" w:hAnsi="Arial"/>
-          <w:sz w:val="20"/>
-          <w:szCs w:val="20"/>
-        </w:rPr>
-        <w:t xml:space="preserve">Detect imbalanced folders (&gt;50 entries or &lt;3 entries), propose splits or merges, move miscategorised entries.</w:t>
+        <w:t xml:space="preserve">Relationship discovery: </w:t>
+      </w:r>
+      <w:r>
+        <w:rPr>
+          <w:rFonts w:ascii="Arial" w:cs="Arial" w:eastAsia="Arial" w:hAnsi="Arial"/>
+          <w:sz w:val="20"/>
+          <w:szCs w:val="20"/>
+        </w:rPr>
+        <w:t xml:space="preserve">After enriching an entry, scan for related entries. Create typed edges: "related-to", "depends-on", "supersedes", "example-of".</w:t>
       </w:r>
     </w:p>
     <w:p>
@@ -1530,15 +1558,15 @@
           <w:sz w:val="20"/>
           <w:szCs w:val="20"/>
         </w:rPr>
-        <w:t xml:space="preserve">Gap analysis: </w:t>
-      </w:r>
-      <w:r>
-        <w:rPr>
-          <w:rFonts w:ascii="Arial" w:cs="Arial" w:eastAsia="Arial" w:hAnsi="Arial"/>
-          <w:sz w:val="20"/>
-          <w:szCs w:val="20"/>
-        </w:rPr>
-        <w:t xml:space="preserve">Examine the library’s shape. Identify domains with thin coverage relative to their importance or usage frequency. Flag gaps for human review or autonomous acquisition.</w:t>
+        <w:t xml:space="preserve">Folder hygiene: </w:t>
+      </w:r>
+      <w:r>
+        <w:rPr>
+          <w:rFonts w:ascii="Arial" w:cs="Arial" w:eastAsia="Arial" w:hAnsi="Arial"/>
+          <w:sz w:val="20"/>
+          <w:szCs w:val="20"/>
+        </w:rPr>
+        <w:t xml:space="preserve">Detect imbalanced folders (&gt;50 entries or &lt;3 entries), propose splits or merges, move miscategorised entries.</w:t>
       </w:r>
     </w:p>
     <w:p>
@@ -1558,15 +1586,15 @@
           <w:sz w:val="20"/>
           <w:szCs w:val="20"/>
         </w:rPr>
-        <w:t xml:space="preserve">Staleness management: </w:t>
-      </w:r>
-      <w:r>
-        <w:rPr>
-          <w:rFonts w:ascii="Arial" w:cs="Arial" w:eastAsia="Arial" w:hAnsi="Arial"/>
-          <w:sz w:val="20"/>
-          <w:szCs w:val="20"/>
-        </w:rPr>
-        <w:t xml:space="preserve">Apply decay models by knowledge type. Tech-specific entries decay fast (6–12 months), conceptual entries decay slowly (2–5 years). Re-check entries past their review-by date.</w:t>
+        <w:t xml:space="preserve">Gap analysis: </w:t>
+      </w:r>
+      <w:r>
+        <w:rPr>
+          <w:rFonts w:ascii="Arial" w:cs="Arial" w:eastAsia="Arial" w:hAnsi="Arial"/>
+          <w:sz w:val="20"/>
+          <w:szCs w:val="20"/>
+        </w:rPr>
+        <w:t xml:space="preserve">Examine the library’s shape. Identify domains with thin coverage relative to their importance or usage frequency. Flag gaps for human review or autonomous acquisition.</w:t>
       </w:r>
     </w:p>
     <w:p>
@@ -1586,68 +1614,15 @@
           <w:sz w:val="20"/>
           <w:szCs w:val="20"/>
         </w:rPr>
-        <w:t xml:space="preserve">Quality scoring: </w:t>
-      </w:r>
-      <w:r>
-        <w:rPr>
-          <w:rFonts w:ascii="Arial" w:cs="Arial" w:eastAsia="Arial" w:hAnsi="Arial"/>
-          <w:sz w:val="20"/>
-          <w:szCs w:val="20"/>
-        </w:rPr>
-        <w:t xml:space="preserve">Maintain an overall quality score per entry (completeness, accuracy, recency, link health). Surface the lowest-quality entries for priority attention.</w:t>
-      </w:r>
-    </w:p>
-    <w:p>
-      <w:pPr>
-        <w:spacing w:before="60" w:after="60"/>
-      </w:pPr>
-    </w:p>
-    <w:p>
-      <w:pPr>
-        <w:pStyle w:val="Heading3"/>
-      </w:pPr>
-      <w:r>
-        <w:rPr>
-          <w:rFonts w:ascii="Arial" w:cs="Arial" w:eastAsia="Arial" w:hAnsi="Arial"/>
-        </w:rPr>
-        <w:t xml:space="preserve">Refinement Audit Log</w:t>
-      </w:r>
-    </w:p>
-    <w:p>
-      <w:pPr>
-        <w:spacing w:before="80" w:after="80"/>
-      </w:pPr>
-      <w:r>
-        <w:rPr>
-          <w:rFonts w:ascii="Arial" w:cs="Arial" w:eastAsia="Arial" w:hAnsi="Arial"/>
-          <w:sz w:val="20"/>
-          <w:szCs w:val="20"/>
-        </w:rPr>
-        <w:t xml:space="preserve">Every librarian action produces a log entry: what changed, why, what the entry looked like before, and a confidence level. This enables rollback and builds trust in automated curation.</w:t>
-      </w:r>
-    </w:p>
-    <w:p>
-      <w:pPr>
-        <w:pStyle w:val="Heading2"/>
-      </w:pPr>
-      <w:r>
-        <w:rPr>
-          <w:rFonts w:ascii="Arial" w:cs="Arial" w:eastAsia="Arial" w:hAnsi="Arial"/>
-        </w:rPr>
-        <w:t xml:space="preserve">Researcher (Reference Desk)</w:t>
-      </w:r>
-    </w:p>
-    <w:p>
-      <w:pPr>
-        <w:spacing w:before="80" w:after="80"/>
-      </w:pPr>
-      <w:r>
-        <w:rPr>
-          <w:rFonts w:ascii="Arial" w:cs="Arial" w:eastAsia="Arial" w:hAnsi="Arial"/>
-          <w:sz w:val="20"/>
-          <w:szCs w:val="20"/>
-        </w:rPr>
-        <w:t xml:space="preserve">The researcher is the query interface. Other agents and humans talk to the researcher when they need knowledge.</w:t>
+        <w:t xml:space="preserve">Staleness management: </w:t>
+      </w:r>
+      <w:r>
+        <w:rPr>
+          <w:rFonts w:ascii="Arial" w:cs="Arial" w:eastAsia="Arial" w:hAnsi="Arial"/>
+          <w:sz w:val="20"/>
+          <w:szCs w:val="20"/>
+        </w:rPr>
+        <w:t xml:space="preserve">Apply decay models by knowledge type. Tech-specific entries decay fast (6–12 months), conceptual entries decay slowly (2–5 years). Re-check entries past their review-by date.</w:t>
       </w:r>
     </w:p>
     <w:p>
@@ -1667,15 +1642,68 @@
           <w:sz w:val="20"/>
           <w:szCs w:val="20"/>
         </w:rPr>
-        <w:t xml:space="preserve">Query routing: </w:t>
-      </w:r>
-      <w:r>
-        <w:rPr>
-          <w:rFonts w:ascii="Arial" w:cs="Arial" w:eastAsia="Arial" w:hAnsi="Arial"/>
-          <w:sz w:val="20"/>
-          <w:szCs w:val="20"/>
-        </w:rPr>
-        <w:t xml:space="preserve">Determine the best retrieval strategy for each query. Exact match → folder lookup. Vague question → vector search. Exploratory → graph traversal. Filtered → tag query.</w:t>
+        <w:t xml:space="preserve">Quality scoring: </w:t>
+      </w:r>
+      <w:r>
+        <w:rPr>
+          <w:rFonts w:ascii="Arial" w:cs="Arial" w:eastAsia="Arial" w:hAnsi="Arial"/>
+          <w:sz w:val="20"/>
+          <w:szCs w:val="20"/>
+        </w:rPr>
+        <w:t xml:space="preserve">Maintain an overall quality score per entry (completeness, accuracy, recency, link health). Surface the lowest-quality entries for priority attention.</w:t>
+      </w:r>
+    </w:p>
+    <w:p>
+      <w:pPr>
+        <w:spacing w:before="60" w:after="60"/>
+      </w:pPr>
+    </w:p>
+    <w:p>
+      <w:pPr>
+        <w:pStyle w:val="Heading3"/>
+      </w:pPr>
+      <w:r>
+        <w:rPr>
+          <w:rFonts w:ascii="Arial" w:cs="Arial" w:eastAsia="Arial" w:hAnsi="Arial"/>
+        </w:rPr>
+        <w:t xml:space="preserve">Refinement Audit Log</w:t>
+      </w:r>
+    </w:p>
+    <w:p>
+      <w:pPr>
+        <w:spacing w:before="80" w:after="80"/>
+      </w:pPr>
+      <w:r>
+        <w:rPr>
+          <w:rFonts w:ascii="Arial" w:cs="Arial" w:eastAsia="Arial" w:hAnsi="Arial"/>
+          <w:sz w:val="20"/>
+          <w:szCs w:val="20"/>
+        </w:rPr>
+        <w:t xml:space="preserve">Every librarian action produces a log entry: what changed, why, what the entry looked like before, and a confidence level. This enables rollback and builds trust in automated curation.</w:t>
+      </w:r>
+    </w:p>
+    <w:p>
+      <w:pPr>
+        <w:pStyle w:val="Heading2"/>
+      </w:pPr>
+      <w:r>
+        <w:rPr>
+          <w:rFonts w:ascii="Arial" w:cs="Arial" w:eastAsia="Arial" w:hAnsi="Arial"/>
+        </w:rPr>
+        <w:t xml:space="preserve">Researcher (Reference Desk)</w:t>
+      </w:r>
+    </w:p>
+    <w:p>
+      <w:pPr>
+        <w:spacing w:before="80" w:after="80"/>
+      </w:pPr>
+      <w:r>
+        <w:rPr>
+          <w:rFonts w:ascii="Arial" w:cs="Arial" w:eastAsia="Arial" w:hAnsi="Arial"/>
+          <w:sz w:val="20"/>
+          <w:szCs w:val="20"/>
+        </w:rPr>
+        <w:t xml:space="preserve">The researcher is the query interface. Other agents and humans talk to the researcher when they need knowledge.</w:t>
       </w:r>
     </w:p>
     <w:p>
@@ -1695,15 +1723,15 @@
           <w:sz w:val="20"/>
           <w:szCs w:val="20"/>
         </w:rPr>
-        <w:t xml:space="preserve">Multi-strategy fusion: </w:t>
-      </w:r>
-      <w:r>
-        <w:rPr>
-          <w:rFonts w:ascii="Arial" w:cs="Arial" w:eastAsia="Arial" w:hAnsi="Arial"/>
-          <w:sz w:val="20"/>
-          <w:szCs w:val="20"/>
-        </w:rPr>
-        <w:t xml:space="preserve">For complex queries, combine results from multiple indexes and rank by relevance.</w:t>
+        <w:t xml:space="preserve">Query routing: </w:t>
+      </w:r>
+      <w:r>
+        <w:rPr>
+          <w:rFonts w:ascii="Arial" w:cs="Arial" w:eastAsia="Arial" w:hAnsi="Arial"/>
+          <w:sz w:val="20"/>
+          <w:szCs w:val="20"/>
+        </w:rPr>
+        <w:t xml:space="preserve">Determine the best retrieval strategy for each query. Exact match → folder lookup. Vague question → vector search. Exploratory → graph traversal. Filtered → tag query.</w:t>
       </w:r>
     </w:p>
     <w:p>
@@ -1723,15 +1751,15 @@
           <w:sz w:val="20"/>
           <w:szCs w:val="20"/>
         </w:rPr>
-        <w:t xml:space="preserve">Maturity-aware responses: </w:t>
-      </w:r>
-      <w:r>
-        <w:rPr>
-          <w:rFonts w:ascii="Arial" w:cs="Arial" w:eastAsia="Arial" w:hAnsi="Arial"/>
-          <w:sz w:val="20"/>
-          <w:szCs w:val="20"/>
-        </w:rPr>
-        <w:t xml:space="preserve">When returning a stub entry, flag it as low-confidence. When returning a fully enriched entry, flag it as high-confidence. Let the consuming agent decide how to weight it.</w:t>
+        <w:t xml:space="preserve">Multi-strategy fusion: </w:t>
+      </w:r>
+      <w:r>
+        <w:rPr>
+          <w:rFonts w:ascii="Arial" w:cs="Arial" w:eastAsia="Arial" w:hAnsi="Arial"/>
+          <w:sz w:val="20"/>
+          <w:szCs w:val="20"/>
+        </w:rPr>
+        <w:t xml:space="preserve">For complex queries, combine results from multiple indexes and rank by relevance.</w:t>
       </w:r>
     </w:p>
     <w:p>
@@ -1751,15 +1779,15 @@
           <w:sz w:val="20"/>
           <w:szCs w:val="20"/>
         </w:rPr>
-        <w:t xml:space="preserve">Gap detection: </w:t>
-      </w:r>
-      <w:r>
-        <w:rPr>
-          <w:rFonts w:ascii="Arial" w:cs="Arial" w:eastAsia="Arial" w:hAnsi="Arial"/>
-          <w:sz w:val="20"/>
-          <w:szCs w:val="20"/>
-        </w:rPr>
-        <w:t xml:space="preserve">When a query returns no results or only stubs, log a "knowledge:gap" event. The indexer or librarian can then prioritise acquiring or enriching that area.</w:t>
+        <w:t xml:space="preserve">Maturity-aware responses: </w:t>
+      </w:r>
+      <w:r>
+        <w:rPr>
+          <w:rFonts w:ascii="Arial" w:cs="Arial" w:eastAsia="Arial" w:hAnsi="Arial"/>
+          <w:sz w:val="20"/>
+          <w:szCs w:val="20"/>
+        </w:rPr>
+        <w:t xml:space="preserve">When returning a stub entry, flag it as low-confidence. When returning a fully enriched entry, flag it as high-confidence. Let the consuming agent decide how to weight it.</w:t>
       </w:r>
     </w:p>
     <w:p>
@@ -1779,6 +1807,34 @@
           <w:sz w:val="20"/>
           <w:szCs w:val="20"/>
         </w:rPr>
+        <w:t xml:space="preserve">Gap detection: </w:t>
+      </w:r>
+      <w:r>
+        <w:rPr>
+          <w:rFonts w:ascii="Arial" w:cs="Arial" w:eastAsia="Arial" w:hAnsi="Arial"/>
+          <w:sz w:val="20"/>
+          <w:szCs w:val="20"/>
+        </w:rPr>
+        <w:t xml:space="preserve">When a query returns no results or only stubs, log a "knowledge:gap" event. The indexer or librarian can then prioritise acquiring or enriching that area.</w:t>
+      </w:r>
+    </w:p>
+    <w:p>
+      <w:pPr>
+        <w:pStyle w:val="ListParagraph"/>
+        <w:numPr>
+          <w:ilvl w:val="0"/>
+          <w:numId w:val="2"/>
+        </w:numPr>
+        <w:spacing w:before="40" w:after="40"/>
+      </w:pPr>
+      <w:r>
+        <w:rPr>
+          <w:rFonts w:ascii="Arial" w:cs="Arial" w:eastAsia="Arial" w:hAnsi="Arial"/>
+          <w:b/>
+          <w:bCs/>
+          <w:sz w:val="20"/>
+          <w:szCs w:val="20"/>
+        </w:rPr>
         <w:t xml:space="preserve">Context assembly: </w:t>
       </w:r>
       <w:r>
@@ -1788,6 +1844,34 @@
           <w:szCs w:val="20"/>
         </w:rPr>
         <w:t xml:space="preserve">For agents with limited context windows, the researcher should return concise, pre-digested knowledge — not raw documents. Summarise, extract the relevant section, or provide a structured snippet.</w:t>
+      </w:r>
+    </w:p>
+    <w:p>
+      <w:pPr>
+        <w:pStyle w:val="ListParagraph"/>
+        <w:numPr>
+          <w:ilvl w:val="0"/>
+          <w:numId w:val="2"/>
+        </w:numPr>
+        <w:spacing w:before="40" w:after="40"/>
+      </w:pPr>
+      <w:r>
+        <w:rPr>
+          <w:rFonts w:ascii="Arial" w:cs="Arial" w:eastAsia="Arial" w:hAnsi="Arial"/>
+          <w:b/>
+          <w:bCs/>
+          <w:sz w:val="20"/>
+          <w:szCs w:val="20"/>
+        </w:rPr>
+        <w:t xml:space="preserve">Human-readable generation: </w:t>
+      </w:r>
+      <w:r>
+        <w:rPr>
+          <w:rFonts w:ascii="Arial" w:cs="Arial" w:eastAsia="Arial" w:hAnsi="Arial"/>
+          <w:sz w:val="20"/>
+          <w:szCs w:val="20"/>
+        </w:rPr>
+        <w:t xml:space="preserve">When a human queries the library directly, the researcher generates a readable response with narrative, examples, and context — produced on the fly from the inference-optimised foundational entry. For shareable documents, the researcher invokes the human-readable spawn template to produce a formatted artefact.</w:t>
       </w:r>
     </w:p>
     <w:p>
@@ -4623,7 +4707,7 @@
                 <w:sz w:val="20"/>
                 <w:szCs w:val="20"/>
               </w:rPr>
-              <w:t xml:space="preserve">Spawn templates that define how to transform foundational entries into agent-specific configurations. One template per target format. Examples: /meta/templates/claude-skill, /meta/templates/cursor-rule, /meta/templates/openai-instruction.</w:t>
+              <w:t xml:space="preserve">Spawn templates that define how to transform foundational entries into consumer-specific formats. One template per target format, including both agent runtimes and human consumption. Examples: /meta/templates/claude-skill, /meta/templates/cursor-rule, /meta/templates/openai-instruction, /meta/templates/human-readable.</w:t>
             </w:r>
           </w:p>
         </w:tc>
@@ -4774,7 +4858,7 @@
           <w:sz w:val="20"/>
           <w:szCs w:val="20"/>
         </w:rPr>
-        <w:t xml:space="preserve">Patterns for transforming foundational entries into agent-specific configurations. Each template defines: the target format (e.g. Claude SKILL.md, Cursor .cursorrules, OpenAI custom instructions), the extraction logic (which fields to include, how to structure them), and any runtime-specific conventions (e.g. Claude skills expect a specific markdown structure with trigger descriptions).</w:t>
+        <w:t xml:space="preserve">Patterns for transforming foundational entries into consumer-specific formats. Each template defines: the target format, the extraction logic (which fields to include, how to structure them), and any format-specific conventions. Templates exist for agent runtimes (e.g. Claude SKILL.md, Cursor .cursorrules, OpenAI custom instructions) and also for human consumption (e.g. human-readable documentation with narrative, examples, and progressive disclosure).</w:t>
       </w:r>
     </w:p>
     <w:p>
@@ -5451,6 +5535,107 @@
           <w:szCs w:val="20"/>
         </w:rPr>
         <w:t xml:space="preserve">The /meta/ folder is the most critical folder in the library. /meta/governance/ holds the operating rules, /meta/foundational/ holds the procedural knowledge that generates all agent skills, and /meta/templates/ holds the spawn templates that make the projection system work. Everything flows from /meta/.</w:t>
+      </w:r>
+    </w:p>
+    <w:p>
+      <w:pPr>
+        <w:pStyle w:val="Heading2"/>
+      </w:pPr>
+      <w:r>
+        <w:rPr>
+          <w:rFonts w:ascii="Arial" w:cs="Arial" w:eastAsia="Arial" w:hAnsi="Arial"/>
+        </w:rPr>
+        <w:t xml:space="preserve">Human-Readable Projections</w:t>
+      </w:r>
+    </w:p>
+    <w:p>
+      <w:pPr>
+        <w:spacing w:before="80" w:after="80"/>
+      </w:pPr>
+      <w:r>
+        <w:rPr>
+          <w:rFonts w:ascii="Arial" w:cs="Arial" w:eastAsia="Arial" w:hAnsi="Arial"/>
+          <w:sz w:val="20"/>
+          <w:szCs w:val="20"/>
+        </w:rPr>
+        <w:t xml:space="preserve">Since foundational entries are optimised for inference rather than human readability, the library needs a mechanism for producing human-consumable knowledge. This is handled as another projection type, not as a change to the foundational content.</w:t>
+      </w:r>
+    </w:p>
+    <w:p>
+      <w:pPr>
+        <w:spacing w:before="40" w:after="40"/>
+      </w:pPr>
+    </w:p>
+    <w:p>
+      <w:pPr>
+        <w:pStyle w:val="Heading3"/>
+      </w:pPr>
+      <w:r>
+        <w:rPr>
+          <w:rFonts w:ascii="Arial" w:cs="Arial" w:eastAsia="Arial" w:hAnsi="Arial"/>
+        </w:rPr>
+        <w:t xml:space="preserve">Ephemeral (On-the-fly)</w:t>
+      </w:r>
+    </w:p>
+    <w:p>
+      <w:pPr>
+        <w:spacing w:before="80" w:after="80"/>
+      </w:pPr>
+      <w:r>
+        <w:rPr>
+          <w:rFonts w:ascii="Arial" w:cs="Arial" w:eastAsia="Arial" w:hAnsi="Arial"/>
+          <w:sz w:val="20"/>
+          <w:szCs w:val="20"/>
+        </w:rPr>
+        <w:t xml:space="preserve">When a human queries the researcher directly — “explain our OAuth patterns to me” — the researcher assembles context from the foundational entry, its relationships, and related domain knowledge, then generates a readable response with narrative, examples, and context. This response is not stored; it is produced fresh each time.</w:t>
+      </w:r>
+    </w:p>
+    <w:p>
+      <w:pPr>
+        <w:pStyle w:val="Heading3"/>
+      </w:pPr>
+      <w:r>
+        <w:rPr>
+          <w:rFonts w:ascii="Arial" w:cs="Arial" w:eastAsia="Arial" w:hAnsi="Arial"/>
+        </w:rPr>
+        <w:t xml:space="preserve">Generated Artefact (On Request)</w:t>
+      </w:r>
+    </w:p>
+    <w:p>
+      <w:pPr>
+        <w:spacing w:before="80" w:after="80"/>
+      </w:pPr>
+      <w:r>
+        <w:rPr>
+          <w:rFonts w:ascii="Arial" w:cs="Arial" w:eastAsia="Arial" w:hAnsi="Arial"/>
+          <w:sz w:val="20"/>
+          <w:szCs w:val="20"/>
+        </w:rPr>
+        <w:t xml:space="preserve">When someone asks “give me a document I can share with the team about our OAuth patterns,” the system produces a formatted artefact (markdown, docx, or other format) from the foundational entry via the human-readable spawn template. This document is disposable: if the foundational entry changes, the document is regenerated rather than manually updated.</w:t>
+      </w:r>
+    </w:p>
+    <w:p>
+      <w:pPr>
+        <w:pStyle w:val="Heading3"/>
+      </w:pPr>
+      <w:r>
+        <w:rPr>
+          <w:rFonts w:ascii="Arial" w:cs="Arial" w:eastAsia="Arial" w:hAnsi="Arial"/>
+        </w:rPr>
+        <w:t xml:space="preserve">One-Way Discipline</w:t>
+      </w:r>
+    </w:p>
+    <w:p>
+      <w:pPr>
+        <w:spacing w:before="80" w:after="80"/>
+      </w:pPr>
+      <w:r>
+        <w:rPr>
+          <w:rFonts w:ascii="Arial" w:cs="Arial" w:eastAsia="Arial" w:hAnsi="Arial"/>
+          <w:sz w:val="20"/>
+          <w:szCs w:val="20"/>
+        </w:rPr>
+        <w:t xml:space="preserve">Human-readable projections are strictly one-way. They are never edited and pushed back upstream. If a human reads the generated document and spots something wrong, the correction goes to the foundational entry in /meta/foundational/, not to the generated document. The librarian then updates the entry using inference-optimised formatting, and any downstream projections — including the human-readable version — can be regenerated.</w:t>
       </w:r>
     </w:p>
     <w:p>
@@ -6539,6 +6724,599 @@
         <w:rPr>
           <w:rFonts w:ascii="Arial" w:cs="Arial" w:eastAsia="Arial" w:hAnsi="Arial"/>
         </w:rPr>
+        <w:t xml:space="preserve">Quality Assurance &amp; Feedback Loop</w:t>
+      </w:r>
+    </w:p>
+    <w:p>
+      <w:pPr>
+        <w:spacing w:before="80" w:after="80"/>
+      </w:pPr>
+      <w:r>
+        <w:rPr>
+          <w:rFonts w:ascii="Arial" w:cs="Arial" w:eastAsia="Arial" w:hAnsi="Arial"/>
+          <w:sz w:val="20"/>
+          <w:szCs w:val="20"/>
+        </w:rPr>
+        <w:t xml:space="preserve">The library’s knowledge quality cannot be judged by inspecting documents. It is measured through outcomes: do agents get useful answers, do projections work correctly, do humans encounter wrong knowledge? This section defines who checks what, when, and how corrections flow back to the foundational entries.</w:t>
+      </w:r>
+    </w:p>
+    <w:p>
+      <w:pPr>
+        <w:pStyle w:val="Heading2"/>
+      </w:pPr>
+      <w:r>
+        <w:rPr>
+          <w:rFonts w:ascii="Arial" w:cs="Arial" w:eastAsia="Arial" w:hAnsi="Arial"/>
+        </w:rPr>
+        <w:t xml:space="preserve">Continuous Passive Checks (Intern)</w:t>
+      </w:r>
+    </w:p>
+    <w:p>
+      <w:pPr>
+        <w:spacing w:before="80" w:after="80"/>
+      </w:pPr>
+      <w:r>
+        <w:rPr>
+          <w:rFonts w:ascii="Arial" w:cs="Arial" w:eastAsia="Arial" w:hAnsi="Arial"/>
+          <w:sz w:val="20"/>
+          <w:szCs w:val="20"/>
+        </w:rPr>
+        <w:t xml:space="preserve">The intern’s observation is itself the primary quality check. It runs continuously or on a daily/weekly batch, accumulating signals from all system activity:</w:t>
+      </w:r>
+    </w:p>
+    <w:p>
+      <w:pPr>
+        <w:pStyle w:val="ListParagraph"/>
+        <w:numPr>
+          <w:ilvl w:val="0"/>
+          <w:numId w:val="2"/>
+        </w:numPr>
+        <w:spacing w:before="40" w:after="40"/>
+      </w:pPr>
+      <w:r>
+        <w:rPr>
+          <w:rFonts w:ascii="Arial" w:cs="Arial" w:eastAsia="Arial" w:hAnsi="Arial"/>
+          <w:b/>
+          <w:bCs/>
+          <w:sz w:val="20"/>
+          <w:szCs w:val="20"/>
+        </w:rPr>
+        <w:t xml:space="preserve">Retrieval misses: </w:t>
+      </w:r>
+      <w:r>
+        <w:rPr>
+          <w:rFonts w:ascii="Arial" w:cs="Arial" w:eastAsia="Arial" w:hAnsi="Arial"/>
+          <w:sz w:val="20"/>
+          <w:szCs w:val="20"/>
+        </w:rPr>
+        <w:t xml:space="preserve">Researcher queries that return no results or only low-maturity stubs. Indicates content gaps or poor embedding coverage.</w:t>
+      </w:r>
+    </w:p>
+    <w:p>
+      <w:pPr>
+        <w:pStyle w:val="ListParagraph"/>
+        <w:numPr>
+          <w:ilvl w:val="0"/>
+          <w:numId w:val="2"/>
+        </w:numPr>
+        <w:spacing w:before="40" w:after="40"/>
+      </w:pPr>
+      <w:r>
+        <w:rPr>
+          <w:rFonts w:ascii="Arial" w:cs="Arial" w:eastAsia="Arial" w:hAnsi="Arial"/>
+          <w:b/>
+          <w:bCs/>
+          <w:sz w:val="20"/>
+          <w:szCs w:val="20"/>
+        </w:rPr>
+        <w:t xml:space="preserve">Projection errors: </w:t>
+      </w:r>
+      <w:r>
+        <w:rPr>
+          <w:rFonts w:ascii="Arial" w:cs="Arial" w:eastAsia="Arial" w:hAnsi="Arial"/>
+          <w:sz w:val="20"/>
+          <w:szCs w:val="20"/>
+        </w:rPr>
+        <w:t xml:space="preserve">Agent-specific skills or configs that lead to incorrect behaviour. Traces back to ambiguity or incompleteness in the foundational entry.</w:t>
+      </w:r>
+    </w:p>
+    <w:p>
+      <w:pPr>
+        <w:pStyle w:val="ListParagraph"/>
+        <w:numPr>
+          <w:ilvl w:val="0"/>
+          <w:numId w:val="2"/>
+        </w:numPr>
+        <w:spacing w:before="40" w:after="40"/>
+      </w:pPr>
+      <w:r>
+        <w:rPr>
+          <w:rFonts w:ascii="Arial" w:cs="Arial" w:eastAsia="Arial" w:hAnsi="Arial"/>
+          <w:b/>
+          <w:bCs/>
+          <w:sz w:val="20"/>
+          <w:szCs w:val="20"/>
+        </w:rPr>
+        <w:t xml:space="preserve">Agent disagreements: </w:t>
+      </w:r>
+      <w:r>
+        <w:rPr>
+          <w:rFonts w:ascii="Arial" w:cs="Arial" w:eastAsia="Arial" w:hAnsi="Arial"/>
+          <w:sz w:val="20"/>
+          <w:szCs w:val="20"/>
+        </w:rPr>
+        <w:t xml:space="preserve">Indexer and librarian disagree on classification, or researcher returns results the consuming agent ignores. Signals structural misalignment.</w:t>
+      </w:r>
+    </w:p>
+    <w:p>
+      <w:pPr>
+        <w:pStyle w:val="ListParagraph"/>
+        <w:numPr>
+          <w:ilvl w:val="0"/>
+          <w:numId w:val="2"/>
+        </w:numPr>
+        <w:spacing w:before="40" w:after="40"/>
+      </w:pPr>
+      <w:r>
+        <w:rPr>
+          <w:rFonts w:ascii="Arial" w:cs="Arial" w:eastAsia="Arial" w:hAnsi="Arial"/>
+          <w:b/>
+          <w:bCs/>
+          <w:sz w:val="20"/>
+          <w:szCs w:val="20"/>
+        </w:rPr>
+        <w:t xml:space="preserve">Repeated query patterns: </w:t>
+      </w:r>
+      <w:r>
+        <w:rPr>
+          <w:rFonts w:ascii="Arial" w:cs="Arial" w:eastAsia="Arial" w:hAnsi="Arial"/>
+          <w:sz w:val="20"/>
+          <w:szCs w:val="20"/>
+        </w:rPr>
+        <w:t xml:space="preserve">Multiple agents or users asking the same question in different phrasings, suggesting the entry exists but isn’t discoverable (tag gaps, embedding blind spots, synonym gaps).</w:t>
+      </w:r>
+    </w:p>
+    <w:p>
+      <w:pPr>
+        <w:pStyle w:val="ListParagraph"/>
+        <w:numPr>
+          <w:ilvl w:val="0"/>
+          <w:numId w:val="2"/>
+        </w:numPr>
+        <w:spacing w:before="40" w:after="40"/>
+      </w:pPr>
+      <w:r>
+        <w:rPr>
+          <w:rFonts w:ascii="Arial" w:cs="Arial" w:eastAsia="Arial" w:hAnsi="Arial"/>
+          <w:b/>
+          <w:bCs/>
+          <w:sz w:val="20"/>
+          <w:szCs w:val="20"/>
+        </w:rPr>
+        <w:t xml:space="preserve">Correction frequency: </w:t>
+      </w:r>
+      <w:r>
+        <w:rPr>
+          <w:rFonts w:ascii="Arial" w:cs="Arial" w:eastAsia="Arial" w:hAnsi="Arial"/>
+          <w:sz w:val="20"/>
+          <w:szCs w:val="20"/>
+        </w:rPr>
+        <w:t xml:space="preserve">Entries that receive frequent human corrections are likely still suboptimal and need deeper review.</w:t>
+      </w:r>
+    </w:p>
+    <w:p>
+      <w:pPr>
+        <w:spacing w:before="60" w:after="40"/>
+      </w:pPr>
+    </w:p>
+    <w:p>
+      <w:pPr>
+        <w:spacing w:before="80" w:after="80"/>
+      </w:pPr>
+      <w:r>
+        <w:rPr>
+          <w:rFonts w:ascii="Arial" w:cs="Arial" w:eastAsia="Arial" w:hAnsi="Arial"/>
+          <w:sz w:val="20"/>
+          <w:szCs w:val="20"/>
+        </w:rPr>
+        <w:t xml:space="preserve">Weekly, the intern produces a health report: a short digest surfacing the top 5–10 entries or domains most likely to need human attention, with evidence for each. Target: 15–30 minutes of human review time per report. If it takes longer, the intern’s sensitivity needs tuning.</w:t>
+      </w:r>
+    </w:p>
+    <w:p>
+      <w:pPr>
+        <w:pStyle w:val="Heading2"/>
+      </w:pPr>
+      <w:r>
+        <w:rPr>
+          <w:rFonts w:ascii="Arial" w:cs="Arial" w:eastAsia="Arial" w:hAnsi="Arial"/>
+        </w:rPr>
+        <w:t xml:space="preserve">Scheduled Mechanical Checks (Librarian)</w:t>
+      </w:r>
+    </w:p>
+    <w:p>
+      <w:pPr>
+        <w:spacing w:before="80" w:after="80"/>
+      </w:pPr>
+      <w:r>
+        <w:rPr>
+          <w:rFonts w:ascii="Arial" w:cs="Arial" w:eastAsia="Arial" w:hAnsi="Arial"/>
+          <w:sz w:val="20"/>
+          <w:szCs w:val="20"/>
+        </w:rPr>
+        <w:t xml:space="preserve">The librarian runs structural and mechanical checks on a fixed cadence. These do not require human judgment:</w:t>
+      </w:r>
+    </w:p>
+    <w:p>
+      <w:pPr>
+        <w:pStyle w:val="ListParagraph"/>
+        <w:numPr>
+          <w:ilvl w:val="0"/>
+          <w:numId w:val="2"/>
+        </w:numPr>
+        <w:spacing w:before="40" w:after="40"/>
+      </w:pPr>
+      <w:r>
+        <w:rPr>
+          <w:rFonts w:ascii="Arial" w:cs="Arial" w:eastAsia="Arial" w:hAnsi="Arial"/>
+          <w:b/>
+          <w:bCs/>
+          <w:sz w:val="20"/>
+          <w:szCs w:val="20"/>
+        </w:rPr>
+        <w:t xml:space="preserve">Daily: </w:t>
+      </w:r>
+      <w:r>
+        <w:rPr>
+          <w:rFonts w:ascii="Arial" w:cs="Arial" w:eastAsia="Arial" w:hAnsi="Arial"/>
+          <w:sz w:val="20"/>
+          <w:szCs w:val="20"/>
+        </w:rPr>
+        <w:t xml:space="preserve">Link validation. Hit all source URLs, flag broken or redirected links.</w:t>
+      </w:r>
+    </w:p>
+    <w:p>
+      <w:pPr>
+        <w:pStyle w:val="ListParagraph"/>
+        <w:numPr>
+          <w:ilvl w:val="0"/>
+          <w:numId w:val="2"/>
+        </w:numPr>
+        <w:spacing w:before="40" w:after="40"/>
+      </w:pPr>
+      <w:r>
+        <w:rPr>
+          <w:rFonts w:ascii="Arial" w:cs="Arial" w:eastAsia="Arial" w:hAnsi="Arial"/>
+          <w:b/>
+          <w:bCs/>
+          <w:sz w:val="20"/>
+          <w:szCs w:val="20"/>
+        </w:rPr>
+        <w:t xml:space="preserve">Weekly: </w:t>
+      </w:r>
+      <w:r>
+        <w:rPr>
+          <w:rFonts w:ascii="Arial" w:cs="Arial" w:eastAsia="Arial" w:hAnsi="Arial"/>
+          <w:sz w:val="20"/>
+          <w:szCs w:val="20"/>
+        </w:rPr>
+        <w:t xml:space="preserve">Structural balance (folder sizes), maturity distribution (percentage of stubs vs enriched entries), embedding freshness.</w:t>
+      </w:r>
+    </w:p>
+    <w:p>
+      <w:pPr>
+        <w:pStyle w:val="ListParagraph"/>
+        <w:numPr>
+          <w:ilvl w:val="0"/>
+          <w:numId w:val="2"/>
+        </w:numPr>
+        <w:spacing w:before="40" w:after="40"/>
+      </w:pPr>
+      <w:r>
+        <w:rPr>
+          <w:rFonts w:ascii="Arial" w:cs="Arial" w:eastAsia="Arial" w:hAnsi="Arial"/>
+          <w:b/>
+          <w:bCs/>
+          <w:sz w:val="20"/>
+          <w:szCs w:val="20"/>
+        </w:rPr>
+        <w:t xml:space="preserve">Monthly: </w:t>
+      </w:r>
+      <w:r>
+        <w:rPr>
+          <w:rFonts w:ascii="Arial" w:cs="Arial" w:eastAsia="Arial" w:hAnsi="Arial"/>
+          <w:sz w:val="20"/>
+          <w:szCs w:val="20"/>
+        </w:rPr>
+        <w:t xml:space="preserve">Deep taxonomy review. Detect miscategorised entries, propose folder splits or merges, flag unused categories.</w:t>
+      </w:r>
+    </w:p>
+    <w:p>
+      <w:pPr>
+        <w:spacing w:before="80" w:after="80"/>
+      </w:pPr>
+      <w:r>
+        <w:rPr>
+          <w:rFonts w:ascii="Arial" w:cs="Arial" w:eastAsia="Arial" w:hAnsi="Arial"/>
+          <w:sz w:val="20"/>
+          <w:szCs w:val="20"/>
+        </w:rPr>
+        <w:t xml:space="preserve">The librarian self-corrects where confident (e.g. flagging a broken link) and queues for human review where confidence is low (e.g. proposing a folder restructure).</w:t>
+      </w:r>
+    </w:p>
+    <w:p>
+      <w:pPr>
+        <w:pStyle w:val="Heading2"/>
+      </w:pPr>
+      <w:r>
+        <w:rPr>
+          <w:rFonts w:ascii="Arial" w:cs="Arial" w:eastAsia="Arial" w:hAnsi="Arial"/>
+        </w:rPr>
+        <w:t xml:space="preserve">Human Review (Reactive, Not Proactive)</w:t>
+      </w:r>
+    </w:p>
+    <w:p>
+      <w:pPr>
+        <w:spacing w:before="80" w:after="80"/>
+      </w:pPr>
+      <w:r>
+        <w:rPr>
+          <w:rFonts w:ascii="Arial" w:cs="Arial" w:eastAsia="Arial" w:hAnsi="Arial"/>
+          <w:sz w:val="20"/>
+          <w:szCs w:val="20"/>
+        </w:rPr>
+        <w:t xml:space="preserve">Humans are domain experts, not library janitors. They should never browse the library looking for problems, rewrite entries for formatting, check links, or reorganise folders. All of that is agent work. Instead, humans engage through three triggers:</w:t>
+      </w:r>
+    </w:p>
+    <w:p>
+      <w:pPr>
+        <w:spacing w:before="40" w:after="40"/>
+      </w:pPr>
+    </w:p>
+    <w:p>
+      <w:pPr>
+        <w:pStyle w:val="Heading3"/>
+      </w:pPr>
+      <w:r>
+        <w:rPr>
+          <w:rFonts w:ascii="Arial" w:cs="Arial" w:eastAsia="Arial" w:hAnsi="Arial"/>
+        </w:rPr>
+        <w:t xml:space="preserve">Trigger 1: Intern Health Reports</w:t>
+      </w:r>
+    </w:p>
+    <w:p>
+      <w:pPr>
+        <w:spacing w:before="80" w:after="80"/>
+      </w:pPr>
+      <w:r>
+        <w:rPr>
+          <w:rFonts w:ascii="Arial" w:cs="Arial" w:eastAsia="Arial" w:hAnsi="Arial"/>
+          <w:sz w:val="20"/>
+          <w:szCs w:val="20"/>
+        </w:rPr>
+        <w:t xml:space="preserve">The weekly digest surfaces entries needing attention. The human scans it, confirms or corrects the flagged entries, and moves on. Corrections are semantic: “this is wrong,” “this is missing a crucial caveat,” “these two entries are actually about different things.” The librarian translates the correction into properly structured, inference-optimised updates to the foundational entry.</w:t>
+      </w:r>
+    </w:p>
+    <w:p>
+      <w:pPr>
+        <w:pStyle w:val="Heading3"/>
+      </w:pPr>
+      <w:r>
+        <w:rPr>
+          <w:rFonts w:ascii="Arial" w:cs="Arial" w:eastAsia="Arial" w:hAnsi="Arial"/>
+        </w:rPr>
+        <w:t xml:space="preserve">Trigger 2: Natural Work Corrections</w:t>
+      </w:r>
+    </w:p>
+    <w:p>
+      <w:pPr>
+        <w:spacing w:before="80" w:after="80"/>
+      </w:pPr>
+      <w:r>
+        <w:rPr>
+          <w:rFonts w:ascii="Arial" w:cs="Arial" w:eastAsia="Arial" w:hAnsi="Arial"/>
+          <w:sz w:val="20"/>
+          <w:szCs w:val="20"/>
+        </w:rPr>
+        <w:t xml:space="preserve">During normal work, an agent uses a projection and it gives bad advice. The human notices and flags the error. This feedback enters the event queue as a correction event, the librarian updates the foundational entry, and affected projections regenerate. The system should make this feedback path frictionless — one command, one message, one annotation. No context-switching required.</w:t>
+      </w:r>
+    </w:p>
+    <w:p>
+      <w:pPr>
+        <w:pStyle w:val="Heading3"/>
+      </w:pPr>
+      <w:r>
+        <w:rPr>
+          <w:rFonts w:ascii="Arial" w:cs="Arial" w:eastAsia="Arial" w:hAnsi="Arial"/>
+        </w:rPr>
+        <w:t xml:space="preserve">Trigger 3: Threshold Alerts</w:t>
+      </w:r>
+    </w:p>
+    <w:p>
+      <w:pPr>
+        <w:spacing w:before="80" w:after="80"/>
+      </w:pPr>
+      <w:r>
+        <w:rPr>
+          <w:rFonts w:ascii="Arial" w:cs="Arial" w:eastAsia="Arial" w:hAnsi="Arial"/>
+          <w:sz w:val="20"/>
+          <w:szCs w:val="20"/>
+        </w:rPr>
+        <w:t xml:space="preserve">Automated tripwires that escalate to human attention only when something is measurably off:</w:t>
+      </w:r>
+    </w:p>
+    <w:p>
+      <w:pPr>
+        <w:pStyle w:val="ListParagraph"/>
+        <w:numPr>
+          <w:ilvl w:val="0"/>
+          <w:numId w:val="2"/>
+        </w:numPr>
+        <w:spacing w:before="40" w:after="40"/>
+      </w:pPr>
+      <w:r>
+        <w:rPr>
+          <w:rFonts w:ascii="Arial" w:cs="Arial" w:eastAsia="Arial" w:hAnsi="Arial"/>
+          <w:b/>
+          <w:bCs/>
+          <w:sz w:val="20"/>
+          <w:szCs w:val="20"/>
+        </w:rPr>
+        <w:t xml:space="preserve">Researcher hit rate: </w:t>
+      </w:r>
+      <w:r>
+        <w:rPr>
+          <w:rFonts w:ascii="Arial" w:cs="Arial" w:eastAsia="Arial" w:hAnsi="Arial"/>
+          <w:sz w:val="20"/>
+          <w:szCs w:val="20"/>
+        </w:rPr>
+        <w:t xml:space="preserve">Drops below 80%. Indicates widespread content gaps or retrieval degradation.</w:t>
+      </w:r>
+    </w:p>
+    <w:p>
+      <w:pPr>
+        <w:pStyle w:val="ListParagraph"/>
+        <w:numPr>
+          <w:ilvl w:val="0"/>
+          <w:numId w:val="2"/>
+        </w:numPr>
+        <w:spacing w:before="40" w:after="40"/>
+      </w:pPr>
+      <w:r>
+        <w:rPr>
+          <w:rFonts w:ascii="Arial" w:cs="Arial" w:eastAsia="Arial" w:hAnsi="Arial"/>
+          <w:b/>
+          <w:bCs/>
+          <w:sz w:val="20"/>
+          <w:szCs w:val="20"/>
+        </w:rPr>
+        <w:t xml:space="preserve">Intern acceptance rate: </w:t>
+      </w:r>
+      <w:r>
+        <w:rPr>
+          <w:rFonts w:ascii="Arial" w:cs="Arial" w:eastAsia="Arial" w:hAnsi="Arial"/>
+          <w:sz w:val="20"/>
+          <w:szCs w:val="20"/>
+        </w:rPr>
+        <w:t xml:space="preserve">Falls outside the 20–90% band. Below 20% means intern recommendations aren’t useful; above 90% means it’s being too conservative.</w:t>
+      </w:r>
+    </w:p>
+    <w:p>
+      <w:pPr>
+        <w:pStyle w:val="ListParagraph"/>
+        <w:numPr>
+          <w:ilvl w:val="0"/>
+          <w:numId w:val="2"/>
+        </w:numPr>
+        <w:spacing w:before="40" w:after="40"/>
+      </w:pPr>
+      <w:r>
+        <w:rPr>
+          <w:rFonts w:ascii="Arial" w:cs="Arial" w:eastAsia="Arial" w:hAnsi="Arial"/>
+          <w:b/>
+          <w:bCs/>
+          <w:sz w:val="20"/>
+          <w:szCs w:val="20"/>
+        </w:rPr>
+        <w:t xml:space="preserve">Unresolved gaps: </w:t>
+      </w:r>
+      <w:r>
+        <w:rPr>
+          <w:rFonts w:ascii="Arial" w:cs="Arial" w:eastAsia="Arial" w:hAnsi="Arial"/>
+          <w:sz w:val="20"/>
+          <w:szCs w:val="20"/>
+        </w:rPr>
+        <w:t xml:space="preserve">More than 5 knowledge:gap events in a single domain within 14 days.</w:t>
+      </w:r>
+    </w:p>
+    <w:p>
+      <w:pPr>
+        <w:pStyle w:val="ListParagraph"/>
+        <w:numPr>
+          <w:ilvl w:val="0"/>
+          <w:numId w:val="2"/>
+        </w:numPr>
+        <w:spacing w:before="40" w:after="40"/>
+      </w:pPr>
+      <w:r>
+        <w:rPr>
+          <w:rFonts w:ascii="Arial" w:cs="Arial" w:eastAsia="Arial" w:hAnsi="Arial"/>
+          <w:b/>
+          <w:bCs/>
+          <w:sz w:val="20"/>
+          <w:szCs w:val="20"/>
+        </w:rPr>
+        <w:t xml:space="preserve">Projection failure rate: </w:t>
+      </w:r>
+      <w:r>
+        <w:rPr>
+          <w:rFonts w:ascii="Arial" w:cs="Arial" w:eastAsia="Arial" w:hAnsi="Arial"/>
+          <w:sz w:val="20"/>
+          <w:szCs w:val="20"/>
+        </w:rPr>
+        <w:t xml:space="preserve">Agents using projected skills report errors above a baseline threshold.</w:t>
+      </w:r>
+    </w:p>
+    <w:p>
+      <w:pPr>
+        <w:pStyle w:val="Heading2"/>
+      </w:pPr>
+      <w:r>
+        <w:rPr>
+          <w:rFonts w:ascii="Arial" w:cs="Arial" w:eastAsia="Arial" w:hAnsi="Arial"/>
+        </w:rPr>
+        <w:t xml:space="preserve">A/B Experimentation</w:t>
+      </w:r>
+    </w:p>
+    <w:p>
+      <w:pPr>
+        <w:spacing w:before="80" w:after="80"/>
+      </w:pPr>
+      <w:r>
+        <w:rPr>
+          <w:rFonts w:ascii="Arial" w:cs="Arial" w:eastAsia="Arial" w:hAnsi="Arial"/>
+          <w:sz w:val="20"/>
+          <w:szCs w:val="20"/>
+        </w:rPr>
+        <w:t xml:space="preserve">To empirically discover what “optimised for inference” means for the library’s specific agents and domains, the librarian can produce variant versions of a foundational entry — one denser, one more verbose, one restructured differently — and measure which produces better researcher answers or projection quality. The intern tracks outcomes over time and learns which refinement patterns tend to improve performance. This builds an evidence base for content design decisions rather than relying on intuition.</w:t>
+      </w:r>
+    </w:p>
+    <w:p>
+      <w:pPr>
+        <w:pStyle w:val="Heading2"/>
+      </w:pPr>
+      <w:r>
+        <w:rPr>
+          <w:rFonts w:ascii="Arial" w:cs="Arial" w:eastAsia="Arial" w:hAnsi="Arial"/>
+        </w:rPr>
+        <w:t xml:space="preserve">What Humans Contribute</w:t>
+      </w:r>
+    </w:p>
+    <w:p>
+      <w:pPr>
+        <w:spacing w:before="80" w:after="80"/>
+      </w:pPr>
+      <w:r>
+        <w:rPr>
+          <w:rFonts w:ascii="Arial" w:cs="Arial" w:eastAsia="Arial" w:hAnsi="Arial"/>
+          <w:sz w:val="20"/>
+          <w:szCs w:val="20"/>
+        </w:rPr>
+        <w:t xml:space="preserve">The irreplaceable human inputs are: domain expertise (is this actually correct?), completeness judgments (is this missing something critical?), strategic direction (we’re migrating to a new auth system, the library needs to reflect that), and ground truth corrections. Humans do not need to understand how agents process content. They just need to answer: “is what the library believes actually correct and complete?”</w:t>
+      </w:r>
+    </w:p>
+    <w:p>
+      <w:r>
+        <w:br w:type="page"/>
+      </w:r>
+    </w:p>
+    <w:p>
+      <w:pPr>
+        <w:pStyle w:val="Heading1"/>
+      </w:pPr>
+      <w:r>
+        <w:rPr>
+          <w:rFonts w:ascii="Arial" w:cs="Arial" w:eastAsia="Arial" w:hAnsi="Arial"/>
+        </w:rPr>
         <w:t xml:space="preserve">Technology Stack</w:t>
       </w:r>
     </w:p>
@@ -7869,7 +8647,7 @@
           <w:sz w:val="20"/>
           <w:szCs w:val="20"/>
         </w:rPr>
-        <w:t xml:space="preserve">For stub entries, fetch the source URL, extract content, generate a standalone summary, update the maturity score.</w:t>
+        <w:t xml:space="preserve">For stub entries, fetch the source URL, extract content, generate a standalone summary, update the maturity score. All enrichment follows the inference-first principle: dense, declarative, explicit structure over narrative prose.</w:t>
       </w:r>
     </w:p>
     <w:p>
@@ -8099,7 +8877,7 @@
           <w:sz w:val="20"/>
           <w:szCs w:val="20"/>
         </w:rPr>
-        <w:t xml:space="preserve">Create the first spawn templates in /meta/templates/ for Claude skill format. Document the template format so new agent runtimes can be onboarded by writing a single template.</w:t>
+        <w:t xml:space="preserve">Create the first spawn templates in /meta/templates/ for Claude skill format and the human-readable format. Document the template format so new agent runtimes or output formats can be onboarded by writing a single template.</w:t>
       </w:r>
     </w:p>
     <w:p>
@@ -8295,7 +9073,7 @@
           <w:sz w:val="20"/>
           <w:szCs w:val="20"/>
         </w:rPr>
-        <w:t xml:space="preserve">A simple interface where humans can approve, reject, or defer intern recommendations. Accepted recommendations become tasks for the librarian or updates to /meta/foundational/ entries.</w:t>
+        <w:t xml:space="preserve">A simple interface where humans can approve, reject, or defer intern recommendations. Includes the weekly health report digest. Accepted recommendations become tasks for the librarian or updates to /meta/foundational/ entries. Threshold alerts notify humans when metrics breach targets.</w:t>
       </w:r>
     </w:p>
     <w:p>
@@ -8323,7 +9101,7 @@
           <w:sz w:val="20"/>
           <w:szCs w:val="20"/>
         </w:rPr>
-        <w:t xml:space="preserve">The library is a self-improving, self-aware knowledge system with proactive gap filling, quality management, automated projection generation, and an institutional learning loop via the intern.</w:t>
+        <w:t xml:space="preserve">The library is a self-improving, self-aware knowledge system with proactive gap filling, quality management, automated projection generation (including human-readable documents), and a complete feedback loop from outcomes back to foundational entries via the intern.</w:t>
       </w:r>
     </w:p>
     <w:p>
@@ -10132,7 +10910,7 @@
           <w:sz w:val="20"/>
           <w:szCs w:val="20"/>
         </w:rPr>
-        <w:t xml:space="preserve">Define the Claude skill format template early. Even before the projection generator is automated (Phase 4), manually generating a few .claude/skills/ files from foundational entries validates the separation model.</w:t>
+        <w:t xml:space="preserve">Define the Claude skill format template and the human-readable format template early. Even before the projection generator is automated (Phase 4), manually generating a few projections from foundational entries validates the separation model and the inference-first content approach.</w:t>
       </w:r>
     </w:p>
     <w:sectPr>

</xml_diff>